<commit_message>
captacao: enriquece exemplos com referências de coleta ampla do SALIC
Coleta ampliada para as 8 áreas do SALIC (800 projetos culturais), com detalhamento
(objetivos/justificativa) em Audiovisual e Humanidades. As minutas-exemplo passam a
recuperar referências reais mais próximas do objeto (documentários ambientais/educativos).

Co-Authored-By: Claude Opus 4.8 <noreply@anthropic.com>
Claude-Session: https://claude.ai/code/session_01TvJJ1FXxdSHDiQPT7LHXJn
</commit_message>
<xml_diff>
--- a/captacao/exemplos/cultura-nossa-costa-documentario-educativo-do-litoral-norte.docx
+++ b/captacao/exemplos/cultura-nossa-costa-documentario-educativo-do-litoral-norte.docx
@@ -1019,52 +1019,52 @@
         <w:rPr>
           <w:b/>
         </w:rPr>
-        <w:t xml:space="preserve">VIDA URGENTE</w:t>
-      </w:r>
-      <w:r>
-        <w:t xml:space="preserve"> [Audiovisual] (265230) — aprovado: R$ 899.992,49 — PORAO PRODUCOES LTDA</w:t>
-      </w:r>
-    </w:p>
-    <w:p>
-      <w:pPr>
-        <w:pStyle w:val="ListaMarc"/>
-      </w:pPr>
-      <w:r>
-        <w:rPr>
-          <w:b/>
-        </w:rPr>
-        <w:t xml:space="preserve">GRILO — A história de Leandro Dora, o Legado de um Treinador</w:t>
-      </w:r>
-      <w:r>
-        <w:t xml:space="preserve"> [Audiovisual] (265228) — aprovado: R$ 560.929,05 — APRIMORESURF LTDA</w:t>
-      </w:r>
-    </w:p>
-    <w:p>
-      <w:pPr>
-        <w:pStyle w:val="ListaMarc"/>
-      </w:pPr>
-      <w:r>
-        <w:rPr>
-          <w:b/>
-        </w:rPr>
-        <w:t xml:space="preserve">Mulherial de Dança</w:t>
-      </w:r>
-      <w:r>
-        <w:t xml:space="preserve"> [Audiovisual] (265226) — aprovado: R$ 593.486,25 — AGUA DE LEVANTE PRODUCOES LTDA</w:t>
-      </w:r>
-    </w:p>
-    <w:p>
-      <w:pPr>
-        <w:pStyle w:val="ListaMarc"/>
-      </w:pPr>
-      <w:r>
-        <w:rPr>
-          <w:b/>
-        </w:rPr>
-        <w:t xml:space="preserve">ENCONTRO DE CINEMA NEGRO ZÓZIMO BULBUL BRASIL, ÁFRICA, CARIBE E OUTRAS DIÁSPORAS - 19 ANOS</w:t>
-      </w:r>
-      <w:r>
-        <w:t xml:space="preserve"> [Audiovisual] (265227) — aprovado: R$ 592.812,00 — CENTRO AFRO CARIOCA DE CINEMA</w:t>
+        <w:t xml:space="preserve">O Meio é o Ambiente - Águas de Piri</w:t>
+      </w:r>
+      <w:r>
+        <w:t xml:space="preserve"> [Audiovisual] (265202) — aprovado: R$ 328.627,53 — CASA DE PRODUCAO AUDIOVISUAL DIGITAL LTDA</w:t>
+      </w:r>
+    </w:p>
+    <w:p>
+      <w:pPr>
+        <w:pStyle w:val="ListaMarc"/>
+      </w:pPr>
+      <w:r>
+        <w:rPr>
+          <w:b/>
+        </w:rPr>
+        <w:t xml:space="preserve">O Rio que Fala</w:t>
+      </w:r>
+      <w:r>
+        <w:t xml:space="preserve"> [Audiovisual] (265199) — aprovado: R$ 801.182,82 — CONTEUDOS DIVERSOS PRODUCOES LTDA.</w:t>
+      </w:r>
+    </w:p>
+    <w:p>
+      <w:pPr>
+        <w:pStyle w:val="ListaMarc"/>
+      </w:pPr>
+      <w:r>
+        <w:rPr>
+          <w:b/>
+        </w:rPr>
+        <w:t xml:space="preserve">Entre a Pista e o Mundo: Corpo, Velocidade e Paixão</w:t>
+      </w:r>
+      <w:r>
+        <w:t xml:space="preserve"> [Audiovisual] (264686) — aprovado: R$ 349.945,77 — CUT N TOUCH FILMES LTDA</w:t>
+      </w:r>
+    </w:p>
+    <w:p>
+      <w:pPr>
+        <w:pStyle w:val="ListaMarc"/>
+      </w:pPr>
+      <w:r>
+        <w:rPr>
+          <w:b/>
+        </w:rPr>
+        <w:t xml:space="preserve">Inside Out Brasil — Websérie Documental Sobre a Cultura do Tênis</w:t>
+      </w:r>
+      <w:r>
+        <w:t xml:space="preserve"> [Audiovisual] (265208) — aprovado: R$ 794.475,00 — GRATTITUDE FILMS PRODUCTIONS LTDA</w:t>
       </w:r>
     </w:p>
     <w:p>

</xml_diff>